<commit_message>
design discussion, folder structure fix
</commit_message>
<xml_diff>
--- a/Misc/Theme & Story.docx
+++ b/Misc/Theme & Story.docx
@@ -1,6 +1,6 @@
 
 <file path=word/document.xml><?xml version="1.0" encoding="utf-8"?>
-<w:document xmlns:wpc="http://schemas.microsoft.com/office/word/2010/wordprocessingCanvas" xmlns:cx="http://schemas.microsoft.com/office/drawing/2014/chartex" xmlns:cx1="http://schemas.microsoft.com/office/drawing/2015/9/8/chartex" xmlns:cx2="http://schemas.microsoft.com/office/drawing/2015/10/21/chartex" xmlns:cx3="http://schemas.microsoft.com/office/drawing/2016/5/9/chartex" xmlns:cx4="http://schemas.microsoft.com/office/drawing/2016/5/10/chartex" xmlns:cx5="http://schemas.microsoft.com/office/drawing/2016/5/11/chartex" xmlns:cx6="http://schemas.microsoft.com/office/drawing/2016/5/12/chartex" xmlns:cx7="http://schemas.microsoft.com/office/drawing/2016/5/13/chartex" xmlns:cx8="http://schemas.microsoft.com/office/drawing/2016/5/14/chartex" xmlns:mc="http://schemas.openxmlformats.org/markup-compatibility/2006" xmlns:aink="http://schemas.microsoft.com/office/drawing/2016/ink" xmlns:am3d="http://schemas.microsoft.com/office/drawing/2017/model3d" xmlns:o="urn:schemas-microsoft-com:office:office" xmlns:r="http://schemas.openxmlformats.org/officeDocument/2006/relationships" xmlns:m="http://schemas.openxmlformats.org/officeDocument/2006/math" xmlns:v="urn:schemas-microsoft-com:vml" xmlns:wp14="http://schemas.microsoft.com/office/word/2010/wordprocessingDrawing" xmlns:wp="http://schemas.openxmlformats.org/drawingml/2006/wordprocessingDrawing" xmlns:w10="urn:schemas-microsoft-com:office:word" xmlns:w="http://schemas.openxmlformats.org/wordprocessingml/2006/main" xmlns:w14="http://schemas.microsoft.com/office/word/2010/wordml" xmlns:w15="http://schemas.microsoft.com/office/word/2012/wordml" xmlns:w16cex="http://schemas.microsoft.com/office/word/2018/wordml/cex" xmlns:w16cid="http://schemas.microsoft.com/office/word/2016/wordml/cid" xmlns:w16="http://schemas.microsoft.com/office/word/2018/wordml" xmlns:w16sdtdh="http://schemas.microsoft.com/office/word/2020/wordml/sdtdatahash" xmlns:w16se="http://schemas.microsoft.com/office/word/2015/wordml/symex" xmlns:wpg="http://schemas.microsoft.com/office/word/2010/wordprocessingGroup" xmlns:wpi="http://schemas.microsoft.com/office/word/2010/wordprocessingInk" xmlns:wne="http://schemas.microsoft.com/office/word/2006/wordml" xmlns:wps="http://schemas.microsoft.com/office/word/2010/wordprocessingShape" mc:Ignorable="w14 w15 w16se w16cid w16 w16cex w16sdtdh wp14">
+<w:document xmlns:wpc="http://schemas.microsoft.com/office/word/2010/wordprocessingCanvas" xmlns:cx="http://schemas.microsoft.com/office/drawing/2014/chartex" xmlns:cx1="http://schemas.microsoft.com/office/drawing/2015/9/8/chartex" xmlns:cx2="http://schemas.microsoft.com/office/drawing/2015/10/21/chartex" xmlns:cx3="http://schemas.microsoft.com/office/drawing/2016/5/9/chartex" xmlns:cx4="http://schemas.microsoft.com/office/drawing/2016/5/10/chartex" xmlns:cx5="http://schemas.microsoft.com/office/drawing/2016/5/11/chartex" xmlns:cx6="http://schemas.microsoft.com/office/drawing/2016/5/12/chartex" xmlns:cx7="http://schemas.microsoft.com/office/drawing/2016/5/13/chartex" xmlns:cx8="http://schemas.microsoft.com/office/drawing/2016/5/14/chartex" xmlns:mc="http://schemas.openxmlformats.org/markup-compatibility/2006" xmlns:aink="http://schemas.microsoft.com/office/drawing/2016/ink" xmlns:am3d="http://schemas.microsoft.com/office/drawing/2017/model3d" xmlns:o="urn:schemas-microsoft-com:office:office" xmlns:oel="http://schemas.microsoft.com/office/2019/extlst" xmlns:r="http://schemas.openxmlformats.org/officeDocument/2006/relationships" xmlns:m="http://schemas.openxmlformats.org/officeDocument/2006/math" xmlns:v="urn:schemas-microsoft-com:vml" xmlns:wp14="http://schemas.microsoft.com/office/word/2010/wordprocessingDrawing" xmlns:wp="http://schemas.openxmlformats.org/drawingml/2006/wordprocessingDrawing" xmlns:w10="urn:schemas-microsoft-com:office:word" xmlns:w="http://schemas.openxmlformats.org/wordprocessingml/2006/main" xmlns:w14="http://schemas.microsoft.com/office/word/2010/wordml" xmlns:w15="http://schemas.microsoft.com/office/word/2012/wordml" xmlns:w16cex="http://schemas.microsoft.com/office/word/2018/wordml/cex" xmlns:w16cid="http://schemas.microsoft.com/office/word/2016/wordml/cid" xmlns:w16="http://schemas.microsoft.com/office/word/2018/wordml" xmlns:w16du="http://schemas.microsoft.com/office/word/2023/wordml/word16du" xmlns:w16sdtdh="http://schemas.microsoft.com/office/word/2020/wordml/sdtdatahash" xmlns:w16sdtfl="http://schemas.microsoft.com/office/word/2024/wordml/sdtformatlock" xmlns:w16se="http://schemas.microsoft.com/office/word/2015/wordml/symex" xmlns:wpg="http://schemas.microsoft.com/office/word/2010/wordprocessingGroup" xmlns:wpi="http://schemas.microsoft.com/office/word/2010/wordprocessingInk" xmlns:wne="http://schemas.microsoft.com/office/word/2006/wordml" xmlns:wps="http://schemas.microsoft.com/office/word/2010/wordprocessingShape" mc:Ignorable="w14 w15 w16se w16cid w16 w16cex w16sdtdh w16sdtfl w16du wp14">
   <w:body>
     <w:p>
       <w:pPr>
@@ -132,13 +132,226 @@
           <w:lang w:val="en-US"/>
         </w:rPr>
       </w:pPr>
-    </w:p>
-    <w:p>
-      <w:pPr>
-        <w:rPr>
-          <w:lang w:val="en-US"/>
-        </w:rPr>
-      </w:pPr>
+      <w:r>
+        <w:rPr>
+          <w:noProof/>
+          <w:lang w:val="en-US"/>
+        </w:rPr>
+        <mc:AlternateContent>
+          <mc:Choice Requires="wpi">
+            <w:drawing>
+              <wp:anchor distT="0" distB="0" distL="114300" distR="114300" simplePos="0" relativeHeight="251661312" behindDoc="0" locked="0" layoutInCell="1" allowOverlap="1" wp14:anchorId="3E9B56FC" wp14:editId="2D9FAE70">
+                <wp:simplePos x="0" y="0"/>
+                <wp:positionH relativeFrom="column">
+                  <wp:posOffset>1040390</wp:posOffset>
+                </wp:positionH>
+                <wp:positionV relativeFrom="paragraph">
+                  <wp:posOffset>613935</wp:posOffset>
+                </wp:positionV>
+                <wp:extent cx="10800" cy="9360"/>
+                <wp:effectExtent l="38100" t="38100" r="27305" b="29210"/>
+                <wp:wrapNone/>
+                <wp:docPr id="1288377676" name="Ink 4"/>
+                <wp:cNvGraphicFramePr>
+                  <a:graphicFrameLocks xmlns:a="http://schemas.openxmlformats.org/drawingml/2006/main"/>
+                </wp:cNvGraphicFramePr>
+                <a:graphic xmlns:a="http://schemas.openxmlformats.org/drawingml/2006/main">
+                  <a:graphicData uri="http://schemas.microsoft.com/office/word/2010/wordprocessingInk">
+                    <w14:contentPart bwMode="auto" r:id="rId4">
+                      <w14:nvContentPartPr>
+                        <w14:cNvContentPartPr>
+                          <a14:cpLocks xmlns:a14="http://schemas.microsoft.com/office/drawing/2010/main" noRot="1"/>
+                        </w14:cNvContentPartPr>
+                      </w14:nvContentPartPr>
+                      <w14:xfrm>
+                        <a:off x="0" y="0"/>
+                        <a:ext cx="10800" cy="9360"/>
+                      </w14:xfrm>
+                    </w14:contentPart>
+                  </a:graphicData>
+                </a:graphic>
+              </wp:anchor>
+            </w:drawing>
+          </mc:Choice>
+          <mc:Fallback>
+            <w:pict>
+              <v:shapetype w14:anchorId="73F0318C" id="_x0000_t75" coordsize="21600,21600" o:spt="75" o:preferrelative="t" path="m@4@5l@4@11@9@11@9@5xe" filled="f" stroked="f">
+                <v:stroke joinstyle="miter"/>
+                <v:formulas>
+                  <v:f eqn="if lineDrawn pixelLineWidth 0"/>
+                  <v:f eqn="sum @0 1 0"/>
+                  <v:f eqn="sum 0 0 @1"/>
+                  <v:f eqn="prod @2 1 2"/>
+                  <v:f eqn="prod @3 21600 pixelWidth"/>
+                  <v:f eqn="prod @3 21600 pixelHeight"/>
+                  <v:f eqn="sum @0 0 1"/>
+                  <v:f eqn="prod @6 1 2"/>
+                  <v:f eqn="prod @7 21600 pixelWidth"/>
+                  <v:f eqn="sum @8 21600 0"/>
+                  <v:f eqn="prod @7 21600 pixelHeight"/>
+                  <v:f eqn="sum @10 21600 0"/>
+                </v:formulas>
+                <v:path o:extrusionok="f" gradientshapeok="t" o:connecttype="rect"/>
+                <o:lock v:ext="edit" aspectratio="t"/>
+              </v:shapetype>
+              <v:shape id="Ink 4" o:spid="_x0000_s1026" type="#_x0000_t75" style="position:absolute;margin-left:81.4pt;margin-top:47.85pt;width:1.8pt;height:1.75pt;z-index:251661312;visibility:visible;mso-wrap-style:square;mso-wrap-distance-left:9pt;mso-wrap-distance-top:0;mso-wrap-distance-right:9pt;mso-wrap-distance-bottom:0;mso-position-horizontal:absolute;mso-position-horizontal-relative:text;mso-position-vertical:absolute;mso-position-vertical-relative:text" o:gfxdata="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">
+                <v:imagedata r:id="rId5" o:title=""/>
+                <o:lock v:ext="edit" rotation="t" aspectratio="f"/>
+              </v:shape>
+            </w:pict>
+          </mc:Fallback>
+        </mc:AlternateContent>
+      </w:r>
+      <w:r>
+        <w:rPr>
+          <w:noProof/>
+          <w:lang w:val="en-US"/>
+        </w:rPr>
+        <mc:AlternateContent>
+          <mc:Choice Requires="wpi">
+            <w:drawing>
+              <wp:anchor distT="0" distB="0" distL="114300" distR="114300" simplePos="0" relativeHeight="251660288" behindDoc="0" locked="0" layoutInCell="1" allowOverlap="1" wp14:anchorId="1A166A7B" wp14:editId="0F53AC3D">
+                <wp:simplePos x="0" y="0"/>
+                <wp:positionH relativeFrom="column">
+                  <wp:posOffset>1036070</wp:posOffset>
+                </wp:positionH>
+                <wp:positionV relativeFrom="paragraph">
+                  <wp:posOffset>671895</wp:posOffset>
+                </wp:positionV>
+                <wp:extent cx="11880" cy="9360"/>
+                <wp:effectExtent l="38100" t="38100" r="26670" b="29210"/>
+                <wp:wrapNone/>
+                <wp:docPr id="335996577" name="Ink 3"/>
+                <wp:cNvGraphicFramePr>
+                  <a:graphicFrameLocks xmlns:a="http://schemas.openxmlformats.org/drawingml/2006/main"/>
+                </wp:cNvGraphicFramePr>
+                <a:graphic xmlns:a="http://schemas.openxmlformats.org/drawingml/2006/main">
+                  <a:graphicData uri="http://schemas.microsoft.com/office/word/2010/wordprocessingInk">
+                    <w14:contentPart bwMode="auto" r:id="rId6">
+                      <w14:nvContentPartPr>
+                        <w14:cNvContentPartPr>
+                          <a14:cpLocks xmlns:a14="http://schemas.microsoft.com/office/drawing/2010/main" noRot="1"/>
+                        </w14:cNvContentPartPr>
+                      </w14:nvContentPartPr>
+                      <w14:xfrm>
+                        <a:off x="0" y="0"/>
+                        <a:ext cx="11880" cy="9360"/>
+                      </w14:xfrm>
+                    </w14:contentPart>
+                  </a:graphicData>
+                </a:graphic>
+              </wp:anchor>
+            </w:drawing>
+          </mc:Choice>
+          <mc:Fallback>
+            <w:pict>
+              <v:shape w14:anchorId="59EF57E1" id="Ink 3" o:spid="_x0000_s1026" type="#_x0000_t75" style="position:absolute;margin-left:81.1pt;margin-top:52.4pt;width:1.95pt;height:1.75pt;z-index:251660288;visibility:visible;mso-wrap-style:square;mso-wrap-distance-left:9pt;mso-wrap-distance-top:0;mso-wrap-distance-right:9pt;mso-wrap-distance-bottom:0;mso-position-horizontal:absolute;mso-position-horizontal-relative:text;mso-position-vertical:absolute;mso-position-vertical-relative:text" o:gfxdata="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">
+                <v:imagedata r:id="rId7" o:title=""/>
+                <o:lock v:ext="edit" rotation="t" aspectratio="f"/>
+              </v:shape>
+            </w:pict>
+          </mc:Fallback>
+        </mc:AlternateContent>
+      </w:r>
+      <w:r>
+        <w:rPr>
+          <w:noProof/>
+          <w:lang w:val="en-US"/>
+        </w:rPr>
+        <mc:AlternateContent>
+          <mc:Choice Requires="wpi">
+            <w:drawing>
+              <wp:anchor distT="0" distB="0" distL="114300" distR="114300" simplePos="0" relativeHeight="251659264" behindDoc="0" locked="0" layoutInCell="1" allowOverlap="1" wp14:anchorId="440B9839" wp14:editId="478E7A93">
+                <wp:simplePos x="0" y="0"/>
+                <wp:positionH relativeFrom="column">
+                  <wp:posOffset>953990</wp:posOffset>
+                </wp:positionH>
+                <wp:positionV relativeFrom="paragraph">
+                  <wp:posOffset>635175</wp:posOffset>
+                </wp:positionV>
+                <wp:extent cx="18000" cy="10080"/>
+                <wp:effectExtent l="38100" t="38100" r="20320" b="28575"/>
+                <wp:wrapNone/>
+                <wp:docPr id="2110573790" name="Ink 2"/>
+                <wp:cNvGraphicFramePr>
+                  <a:graphicFrameLocks xmlns:a="http://schemas.openxmlformats.org/drawingml/2006/main"/>
+                </wp:cNvGraphicFramePr>
+                <a:graphic xmlns:a="http://schemas.openxmlformats.org/drawingml/2006/main">
+                  <a:graphicData uri="http://schemas.microsoft.com/office/word/2010/wordprocessingInk">
+                    <w14:contentPart bwMode="auto" r:id="rId8">
+                      <w14:nvContentPartPr>
+                        <w14:cNvContentPartPr>
+                          <a14:cpLocks xmlns:a14="http://schemas.microsoft.com/office/drawing/2010/main" noRot="1"/>
+                        </w14:cNvContentPartPr>
+                      </w14:nvContentPartPr>
+                      <w14:xfrm>
+                        <a:off x="0" y="0"/>
+                        <a:ext cx="18000" cy="10080"/>
+                      </w14:xfrm>
+                    </w14:contentPart>
+                  </a:graphicData>
+                </a:graphic>
+              </wp:anchor>
+            </w:drawing>
+          </mc:Choice>
+          <mc:Fallback>
+            <w:pict>
+              <v:shape w14:anchorId="55F70248" id="Ink 2" o:spid="_x0000_s1026" type="#_x0000_t75" style="position:absolute;margin-left:74.6pt;margin-top:49.5pt;width:2.4pt;height:1.8pt;z-index:251659264;visibility:visible;mso-wrap-style:square;mso-wrap-distance-left:9pt;mso-wrap-distance-top:0;mso-wrap-distance-right:9pt;mso-wrap-distance-bottom:0;mso-position-horizontal:absolute;mso-position-horizontal-relative:text;mso-position-vertical:absolute;mso-position-vertical-relative:text" o:gfxdata="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">
+                <v:imagedata r:id="rId9" o:title=""/>
+                <o:lock v:ext="edit" rotation="t" aspectratio="f"/>
+              </v:shape>
+            </w:pict>
+          </mc:Fallback>
+        </mc:AlternateContent>
+      </w:r>
+      <w:r>
+        <w:rPr>
+          <w:lang w:val="en-US"/>
+        </w:rPr>
+        <w:t xml:space="preserve">Chalice / </w:t>
+      </w:r>
+      <w:proofErr w:type="gramStart"/>
+      <w:r>
+        <w:rPr>
+          <w:lang w:val="en-US"/>
+        </w:rPr>
+        <w:t>god</w:t>
+      </w:r>
+      <w:proofErr w:type="gramEnd"/>
+      <w:r>
+        <w:rPr>
+          <w:lang w:val="en-US"/>
+        </w:rPr>
+        <w:t xml:space="preserve"> makes players and anyone he tries to finish of fight his minions because </w:t>
+      </w:r>
+      <w:proofErr w:type="spellStart"/>
+      <w:r>
+        <w:rPr>
+          <w:lang w:val="en-US"/>
+        </w:rPr>
+        <w:t>hes</w:t>
+      </w:r>
+      <w:proofErr w:type="spellEnd"/>
+      <w:r>
+        <w:rPr>
+          <w:lang w:val="en-US"/>
+        </w:rPr>
+        <w:t xml:space="preserve"> too weak to instantly grant death at the moment. His minions are a manifestation of his weakened power. Giving blood of someone, makes a way harder fight in his “underworld”. This is something he does automatically and involuntarily when someone dies. Anyone who escapes is revived because causality needs to ensure they are either dead or alive and surviving the underworld is neither. The causality part is not known to people or the god himself, nobody is sure why a dismembered head reattaches for example. He does try to weaken the minions as the player characters are useful to him but </w:t>
+      </w:r>
+      <w:proofErr w:type="gramStart"/>
+      <w:r>
+        <w:rPr>
+          <w:lang w:val="en-US"/>
+        </w:rPr>
+        <w:t>its</w:t>
+      </w:r>
+      <w:proofErr w:type="gramEnd"/>
+      <w:r>
+        <w:rPr>
+          <w:lang w:val="en-US"/>
+        </w:rPr>
+        <w:t xml:space="preserve"> something that inevitably comes with his existence. The more players decide to permanently kill bosses the more powerful the underworld (and the last boss fight if they don’t side with the god at the end of the game) becomes.  </w:t>
+      </w:r>
     </w:p>
     <w:p>
       <w:pPr>
@@ -260,7 +473,7 @@
 </file>
 
 <file path=word/styles.xml><?xml version="1.0" encoding="utf-8"?>
-<w:styles xmlns:mc="http://schemas.openxmlformats.org/markup-compatibility/2006" xmlns:r="http://schemas.openxmlformats.org/officeDocument/2006/relationships" xmlns:w="http://schemas.openxmlformats.org/wordprocessingml/2006/main" xmlns:w14="http://schemas.microsoft.com/office/word/2010/wordml" xmlns:w15="http://schemas.microsoft.com/office/word/2012/wordml" xmlns:w16cex="http://schemas.microsoft.com/office/word/2018/wordml/cex" xmlns:w16cid="http://schemas.microsoft.com/office/word/2016/wordml/cid" xmlns:w16="http://schemas.microsoft.com/office/word/2018/wordml" xmlns:w16sdtdh="http://schemas.microsoft.com/office/word/2020/wordml/sdtdatahash" xmlns:w16se="http://schemas.microsoft.com/office/word/2015/wordml/symex" mc:Ignorable="w14 w15 w16se w16cid w16 w16cex w16sdtdh">
+<w:styles xmlns:mc="http://schemas.openxmlformats.org/markup-compatibility/2006" xmlns:r="http://schemas.openxmlformats.org/officeDocument/2006/relationships" xmlns:w="http://schemas.openxmlformats.org/wordprocessingml/2006/main" xmlns:w14="http://schemas.microsoft.com/office/word/2010/wordml" xmlns:w15="http://schemas.microsoft.com/office/word/2012/wordml" xmlns:w16cex="http://schemas.microsoft.com/office/word/2018/wordml/cex" xmlns:w16cid="http://schemas.microsoft.com/office/word/2016/wordml/cid" xmlns:w16="http://schemas.microsoft.com/office/word/2018/wordml" xmlns:w16du="http://schemas.microsoft.com/office/word/2023/wordml/word16du" xmlns:w16sdtdh="http://schemas.microsoft.com/office/word/2020/wordml/sdtdatahash" xmlns:w16sdtfl="http://schemas.microsoft.com/office/word/2024/wordml/sdtformatlock" xmlns:w16se="http://schemas.microsoft.com/office/word/2015/wordml/symex" mc:Ignorable="w14 w15 w16se w16cid w16 w16cex w16sdtdh w16sdtfl w16du">
   <w:docDefaults>
     <w:rPrDefault>
       <w:rPr>
@@ -1189,6 +1402,99 @@
 </w:styles>
 </file>
 
+<file path=word/ink/ink1.xml><?xml version="1.0" encoding="utf-8"?>
+<inkml:ink xmlns:inkml="http://www.w3.org/2003/InkML">
+  <inkml:definitions>
+    <inkml:context xml:id="ctx0">
+      <inkml:inkSource xml:id="inkSrc0">
+        <inkml:traceFormat>
+          <inkml:channel name="X" type="integer" min="-2.14748E9" max="2.14748E9" units="cm"/>
+          <inkml:channel name="Y" type="integer" min="-2.14748E9" max="2.14748E9" units="cm"/>
+          <inkml:channel name="F" type="integer" max="32767" units="dev"/>
+          <inkml:channel name="OA" type="integer" max="360" units="deg"/>
+          <inkml:channel name="OE" type="integer" max="90" units="deg"/>
+        </inkml:traceFormat>
+        <inkml:channelProperties>
+          <inkml:channelProperty channel="X" name="resolution" value="1000" units="1/cm"/>
+          <inkml:channelProperty channel="Y" name="resolution" value="1000" units="1/cm"/>
+          <inkml:channelProperty channel="F" name="resolution" value="0" units="1/dev"/>
+          <inkml:channelProperty channel="OA" name="resolution" value="1000" units="1/deg"/>
+          <inkml:channelProperty channel="OE" name="resolution" value="1000" units="1/deg"/>
+        </inkml:channelProperties>
+      </inkml:inkSource>
+      <inkml:timestamp xml:id="ts0" timeString="2026-03-16T15:26:20.279"/>
+    </inkml:context>
+    <inkml:brush xml:id="br0">
+      <inkml:brushProperty name="width" value="0.035" units="cm"/>
+      <inkml:brushProperty name="height" value="0.035" units="cm"/>
+    </inkml:brush>
+  </inkml:definitions>
+  <inkml:trace contextRef="#ctx0" brushRef="#br0">16 1 244 0 0,'0'0'7985'0'0,"-16"22"-8213"0"0,45-19-2961 0 0</inkml:trace>
+</inkml:ink>
+</file>
+
+<file path=word/ink/ink2.xml><?xml version="1.0" encoding="utf-8"?>
+<inkml:ink xmlns:inkml="http://www.w3.org/2003/InkML">
+  <inkml:definitions>
+    <inkml:context xml:id="ctx0">
+      <inkml:inkSource xml:id="inkSrc0">
+        <inkml:traceFormat>
+          <inkml:channel name="X" type="integer" min="-2.14748E9" max="2.14748E9" units="cm"/>
+          <inkml:channel name="Y" type="integer" min="-2.14748E9" max="2.14748E9" units="cm"/>
+          <inkml:channel name="F" type="integer" max="32767" units="dev"/>
+          <inkml:channel name="OA" type="integer" max="360" units="deg"/>
+          <inkml:channel name="OE" type="integer" max="90" units="deg"/>
+        </inkml:traceFormat>
+        <inkml:channelProperties>
+          <inkml:channelProperty channel="X" name="resolution" value="1000" units="1/cm"/>
+          <inkml:channelProperty channel="Y" name="resolution" value="1000" units="1/cm"/>
+          <inkml:channelProperty channel="F" name="resolution" value="0" units="1/dev"/>
+          <inkml:channelProperty channel="OA" name="resolution" value="1000" units="1/deg"/>
+          <inkml:channelProperty channel="OE" name="resolution" value="1000" units="1/deg"/>
+        </inkml:channelProperties>
+      </inkml:inkSource>
+      <inkml:timestamp xml:id="ts0" timeString="2026-03-16T15:26:19.749"/>
+    </inkml:context>
+    <inkml:brush xml:id="br0">
+      <inkml:brushProperty name="width" value="0.035" units="cm"/>
+      <inkml:brushProperty name="height" value="0.035" units="cm"/>
+    </inkml:brush>
+  </inkml:definitions>
+  <inkml:trace contextRef="#ctx0" brushRef="#br0">32 0 112 0 0,'0'0'1544'0'0,"-20"15"172"0"0,9-5-960 0 0</inkml:trace>
+</inkml:ink>
+</file>
+
+<file path=word/ink/ink3.xml><?xml version="1.0" encoding="utf-8"?>
+<inkml:ink xmlns:inkml="http://www.w3.org/2003/InkML">
+  <inkml:definitions>
+    <inkml:context xml:id="ctx0">
+      <inkml:inkSource xml:id="inkSrc0">
+        <inkml:traceFormat>
+          <inkml:channel name="X" type="integer" min="-2.14748E9" max="2.14748E9" units="cm"/>
+          <inkml:channel name="Y" type="integer" min="-2.14748E9" max="2.14748E9" units="cm"/>
+          <inkml:channel name="F" type="integer" max="32767" units="dev"/>
+          <inkml:channel name="OA" type="integer" max="360" units="deg"/>
+          <inkml:channel name="OE" type="integer" max="90" units="deg"/>
+        </inkml:traceFormat>
+        <inkml:channelProperties>
+          <inkml:channelProperty channel="X" name="resolution" value="1000" units="1/cm"/>
+          <inkml:channelProperty channel="Y" name="resolution" value="1000" units="1/cm"/>
+          <inkml:channelProperty channel="F" name="resolution" value="0" units="1/dev"/>
+          <inkml:channelProperty channel="OA" name="resolution" value="1000" units="1/deg"/>
+          <inkml:channelProperty channel="OE" name="resolution" value="1000" units="1/deg"/>
+        </inkml:channelProperties>
+      </inkml:inkSource>
+      <inkml:timestamp xml:id="ts0" timeString="2026-03-16T15:26:18.970"/>
+    </inkml:context>
+    <inkml:brush xml:id="br0">
+      <inkml:brushProperty name="width" value="0.035" units="cm"/>
+      <inkml:brushProperty name="height" value="0.035" units="cm"/>
+    </inkml:brush>
+  </inkml:definitions>
+  <inkml:trace contextRef="#ctx0" brushRef="#br0">50 1 172 0 0,'0'0'2472'0'0,"-27"7"361"0"0,11 3-1869 0 0,9 0-1108 0 0</inkml:trace>
+</inkml:ink>
+</file>
+
 <file path=word/theme/theme1.xml><?xml version="1.0" encoding="utf-8"?>
 <a:theme xmlns:a="http://schemas.openxmlformats.org/drawingml/2006/main" name="Office Theme">
   <a:themeElements>

</xml_diff>

<commit_message>
story of miniboss, design of miniboss
</commit_message>
<xml_diff>
--- a/Misc/Theme & Story.docx
+++ b/Misc/Theme & Story.docx
@@ -135,174 +135,41 @@
       <w:r>
         <w:rPr>
           <w:noProof/>
-          <w:lang w:val="en-US"/>
-        </w:rPr>
-        <mc:AlternateContent>
-          <mc:Choice Requires="wpi">
-            <w:drawing>
-              <wp:anchor distT="0" distB="0" distL="114300" distR="114300" simplePos="0" relativeHeight="251661312" behindDoc="0" locked="0" layoutInCell="1" allowOverlap="1" wp14:anchorId="3E9B56FC" wp14:editId="2D9FAE70">
-                <wp:simplePos x="0" y="0"/>
-                <wp:positionH relativeFrom="column">
-                  <wp:posOffset>1040390</wp:posOffset>
-                </wp:positionH>
-                <wp:positionV relativeFrom="paragraph">
-                  <wp:posOffset>613935</wp:posOffset>
-                </wp:positionV>
-                <wp:extent cx="10800" cy="9360"/>
-                <wp:effectExtent l="38100" t="38100" r="27305" b="29210"/>
-                <wp:wrapNone/>
-                <wp:docPr id="1288377676" name="Ink 4"/>
-                <wp:cNvGraphicFramePr>
-                  <a:graphicFrameLocks xmlns:a="http://schemas.openxmlformats.org/drawingml/2006/main"/>
-                </wp:cNvGraphicFramePr>
-                <a:graphic xmlns:a="http://schemas.openxmlformats.org/drawingml/2006/main">
-                  <a:graphicData uri="http://schemas.microsoft.com/office/word/2010/wordprocessingInk">
-                    <w14:contentPart bwMode="auto" r:id="rId4">
-                      <w14:nvContentPartPr>
-                        <w14:cNvContentPartPr>
-                          <a14:cpLocks xmlns:a14="http://schemas.microsoft.com/office/drawing/2010/main" noRot="1"/>
-                        </w14:cNvContentPartPr>
-                      </w14:nvContentPartPr>
-                      <w14:xfrm>
-                        <a:off x="0" y="0"/>
-                        <a:ext cx="10800" cy="9360"/>
-                      </w14:xfrm>
-                    </w14:contentPart>
-                  </a:graphicData>
-                </a:graphic>
-              </wp:anchor>
-            </w:drawing>
-          </mc:Choice>
-          <mc:Fallback>
-            <w:pict>
-              <v:shapetype w14:anchorId="73F0318C" id="_x0000_t75" coordsize="21600,21600" o:spt="75" o:preferrelative="t" path="m@4@5l@4@11@9@11@9@5xe" filled="f" stroked="f">
-                <v:stroke joinstyle="miter"/>
-                <v:formulas>
-                  <v:f eqn="if lineDrawn pixelLineWidth 0"/>
-                  <v:f eqn="sum @0 1 0"/>
-                  <v:f eqn="sum 0 0 @1"/>
-                  <v:f eqn="prod @2 1 2"/>
-                  <v:f eqn="prod @3 21600 pixelWidth"/>
-                  <v:f eqn="prod @3 21600 pixelHeight"/>
-                  <v:f eqn="sum @0 0 1"/>
-                  <v:f eqn="prod @6 1 2"/>
-                  <v:f eqn="prod @7 21600 pixelWidth"/>
-                  <v:f eqn="sum @8 21600 0"/>
-                  <v:f eqn="prod @7 21600 pixelHeight"/>
-                  <v:f eqn="sum @10 21600 0"/>
-                </v:formulas>
-                <v:path o:extrusionok="f" gradientshapeok="t" o:connecttype="rect"/>
-                <o:lock v:ext="edit" aspectratio="t"/>
-              </v:shapetype>
-              <v:shape id="Ink 4" o:spid="_x0000_s1026" type="#_x0000_t75" style="position:absolute;margin-left:81.4pt;margin-top:47.85pt;width:1.8pt;height:1.75pt;z-index:251661312;visibility:visible;mso-wrap-style:square;mso-wrap-distance-left:9pt;mso-wrap-distance-top:0;mso-wrap-distance-right:9pt;mso-wrap-distance-bottom:0;mso-position-horizontal:absolute;mso-position-horizontal-relative:text;mso-position-vertical:absolute;mso-position-vertical-relative:text" o:gfxdata="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">
-                <v:imagedata r:id="rId5" o:title=""/>
-                <o:lock v:ext="edit" rotation="t" aspectratio="f"/>
-              </v:shape>
-            </w:pict>
-          </mc:Fallback>
-        </mc:AlternateContent>
+        </w:rPr>
+        <w:pict w14:anchorId="06B0FFAE">
+          <v:rect id="Ink 4" o:spid="_x0000_s1028" style="position:absolute;margin-left:81.4pt;margin-top:47.85pt;width:1.8pt;height:1.75pt;z-index:251661312;visibility:visible;mso-wrap-style:square;mso-wrap-distance-left:9pt;mso-wrap-distance-top:0;mso-wrap-distance-right:9pt;mso-wrap-distance-bottom:0;mso-position-horizontal:absolute;mso-position-horizontal-relative:text;mso-position-vertical:absolute;mso-position-vertical-relative:text" coordorigin=",1" coordsize="30,26" filled="f" strokeweight=".35mm">
+            <v:stroke endcap="round"/>
+            <v:path shadowok="f" o:extrusionok="f" fillok="f" insetpenok="f"/>
+            <o:lock v:ext="edit" rotation="t" text="t"/>
+            <o:ink i="AIgBHQIEBAEQWM9UiuaXxU+PBvi60uGbIgMGSBBFI0YjBQU4PT4LZBk3MgqBx///D4DH//8PMwqB&#10;x///D4DH//8POAkA/v8DAAAAAAA9CADQBQMAAHpEPggAtAEDAAB6RAooBIePR+P1gIeAQGVSUIfg&#10;ZvFXx4uqfAtCggCCAAoAESBwCIA9WbXcAb==&#10;" annotation="t"/>
+          </v:rect>
+        </w:pict>
       </w:r>
       <w:r>
         <w:rPr>
           <w:noProof/>
-          <w:lang w:val="en-US"/>
-        </w:rPr>
-        <mc:AlternateContent>
-          <mc:Choice Requires="wpi">
-            <w:drawing>
-              <wp:anchor distT="0" distB="0" distL="114300" distR="114300" simplePos="0" relativeHeight="251660288" behindDoc="0" locked="0" layoutInCell="1" allowOverlap="1" wp14:anchorId="1A166A7B" wp14:editId="0F53AC3D">
-                <wp:simplePos x="0" y="0"/>
-                <wp:positionH relativeFrom="column">
-                  <wp:posOffset>1036070</wp:posOffset>
-                </wp:positionH>
-                <wp:positionV relativeFrom="paragraph">
-                  <wp:posOffset>671895</wp:posOffset>
-                </wp:positionV>
-                <wp:extent cx="11880" cy="9360"/>
-                <wp:effectExtent l="38100" t="38100" r="26670" b="29210"/>
-                <wp:wrapNone/>
-                <wp:docPr id="335996577" name="Ink 3"/>
-                <wp:cNvGraphicFramePr>
-                  <a:graphicFrameLocks xmlns:a="http://schemas.openxmlformats.org/drawingml/2006/main"/>
-                </wp:cNvGraphicFramePr>
-                <a:graphic xmlns:a="http://schemas.openxmlformats.org/drawingml/2006/main">
-                  <a:graphicData uri="http://schemas.microsoft.com/office/word/2010/wordprocessingInk">
-                    <w14:contentPart bwMode="auto" r:id="rId6">
-                      <w14:nvContentPartPr>
-                        <w14:cNvContentPartPr>
-                          <a14:cpLocks xmlns:a14="http://schemas.microsoft.com/office/drawing/2010/main" noRot="1"/>
-                        </w14:cNvContentPartPr>
-                      </w14:nvContentPartPr>
-                      <w14:xfrm>
-                        <a:off x="0" y="0"/>
-                        <a:ext cx="11880" cy="9360"/>
-                      </w14:xfrm>
-                    </w14:contentPart>
-                  </a:graphicData>
-                </a:graphic>
-              </wp:anchor>
-            </w:drawing>
-          </mc:Choice>
-          <mc:Fallback>
-            <w:pict>
-              <v:shape w14:anchorId="59EF57E1" id="Ink 3" o:spid="_x0000_s1026" type="#_x0000_t75" style="position:absolute;margin-left:81.1pt;margin-top:52.4pt;width:1.95pt;height:1.75pt;z-index:251660288;visibility:visible;mso-wrap-style:square;mso-wrap-distance-left:9pt;mso-wrap-distance-top:0;mso-wrap-distance-right:9pt;mso-wrap-distance-bottom:0;mso-position-horizontal:absolute;mso-position-horizontal-relative:text;mso-position-vertical:absolute;mso-position-vertical-relative:text" o:gfxdata="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">
-                <v:imagedata r:id="rId7" o:title=""/>
-                <o:lock v:ext="edit" rotation="t" aspectratio="f"/>
-              </v:shape>
-            </w:pict>
-          </mc:Fallback>
-        </mc:AlternateContent>
+        </w:rPr>
+        <w:pict w14:anchorId="4EE521FF">
+          <v:rect id="Ink 3" o:spid="_x0000_s1027" style="position:absolute;margin-left:81.1pt;margin-top:52.4pt;width:2pt;height:1.75pt;z-index:251660288;visibility:visible;mso-wrap-style:square;mso-wrap-distance-left:9pt;mso-wrap-distance-top:0;mso-wrap-distance-right:9pt;mso-wrap-distance-bottom:0;mso-position-horizontal:absolute;mso-position-horizontal-relative:text;mso-position-vertical:absolute;mso-position-vertical-relative:text" coordorigin="1" coordsize="32,26" filled="f" strokeweight=".35mm">
+            <v:stroke endcap="round"/>
+            <v:path shadowok="f" o:extrusionok="f" fillok="f" insetpenok="f"/>
+            <o:lock v:ext="edit" rotation="t" text="t"/>
+            <o:ink i="AIIBHQIEBAEQWM9UiuaXxU+PBvi60uGbIgMGSBBFI0YjBQU4PT4LZBk3MgqBx///D4DH//8PMwqB&#10;x///D4DH//8POAkA/v8DAAAAAAA9CADQBQMAAHpEPggAtAEDAAB6RAoiBIa+v6eQhiciQIfL3TXb&#10;W5f8ggCCAAoAESBQKS89WbXcAb==&#10;" annotation="t"/>
+          </v:rect>
+        </w:pict>
       </w:r>
       <w:r>
         <w:rPr>
           <w:noProof/>
-          <w:lang w:val="en-US"/>
-        </w:rPr>
-        <mc:AlternateContent>
-          <mc:Choice Requires="wpi">
-            <w:drawing>
-              <wp:anchor distT="0" distB="0" distL="114300" distR="114300" simplePos="0" relativeHeight="251659264" behindDoc="0" locked="0" layoutInCell="1" allowOverlap="1" wp14:anchorId="440B9839" wp14:editId="478E7A93">
-                <wp:simplePos x="0" y="0"/>
-                <wp:positionH relativeFrom="column">
-                  <wp:posOffset>953990</wp:posOffset>
-                </wp:positionH>
-                <wp:positionV relativeFrom="paragraph">
-                  <wp:posOffset>635175</wp:posOffset>
-                </wp:positionV>
-                <wp:extent cx="18000" cy="10080"/>
-                <wp:effectExtent l="38100" t="38100" r="20320" b="28575"/>
-                <wp:wrapNone/>
-                <wp:docPr id="2110573790" name="Ink 2"/>
-                <wp:cNvGraphicFramePr>
-                  <a:graphicFrameLocks xmlns:a="http://schemas.openxmlformats.org/drawingml/2006/main"/>
-                </wp:cNvGraphicFramePr>
-                <a:graphic xmlns:a="http://schemas.openxmlformats.org/drawingml/2006/main">
-                  <a:graphicData uri="http://schemas.microsoft.com/office/word/2010/wordprocessingInk">
-                    <w14:contentPart bwMode="auto" r:id="rId8">
-                      <w14:nvContentPartPr>
-                        <w14:cNvContentPartPr>
-                          <a14:cpLocks xmlns:a14="http://schemas.microsoft.com/office/drawing/2010/main" noRot="1"/>
-                        </w14:cNvContentPartPr>
-                      </w14:nvContentPartPr>
-                      <w14:xfrm>
-                        <a:off x="0" y="0"/>
-                        <a:ext cx="18000" cy="10080"/>
-                      </w14:xfrm>
-                    </w14:contentPart>
-                  </a:graphicData>
-                </a:graphic>
-              </wp:anchor>
-            </w:drawing>
-          </mc:Choice>
-          <mc:Fallback>
-            <w:pict>
-              <v:shape w14:anchorId="55F70248" id="Ink 2" o:spid="_x0000_s1026" type="#_x0000_t75" style="position:absolute;margin-left:74.6pt;margin-top:49.5pt;width:2.4pt;height:1.8pt;z-index:251659264;visibility:visible;mso-wrap-style:square;mso-wrap-distance-left:9pt;mso-wrap-distance-top:0;mso-wrap-distance-right:9pt;mso-wrap-distance-bottom:0;mso-position-horizontal:absolute;mso-position-horizontal-relative:text;mso-position-vertical:absolute;mso-position-vertical-relative:text" o:gfxdata="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">
-                <v:imagedata r:id="rId9" o:title=""/>
-                <o:lock v:ext="edit" rotation="t" aspectratio="f"/>
-              </v:shape>
-            </w:pict>
-          </mc:Fallback>
-        </mc:AlternateContent>
+        </w:rPr>
+        <w:pict w14:anchorId="252D4923">
+          <v:rect id="Ink 2" o:spid="_x0000_s1026" style="position:absolute;margin-left:74.65pt;margin-top:49.5pt;width:2.35pt;height:1.8pt;z-index:251659264;visibility:visible;mso-wrap-style:square;mso-wrap-distance-left:9pt;mso-wrap-distance-top:0;mso-wrap-distance-right:9pt;mso-wrap-distance-bottom:0;mso-position-horizontal:absolute;mso-position-horizontal-relative:text;mso-position-vertical:absolute;mso-position-vertical-relative:text" coordorigin=",1" coordsize="51,28" filled="f" strokeweight=".35mm">
+            <v:stroke endcap="round"/>
+            <v:path shadowok="f" o:extrusionok="f" fillok="f" insetpenok="f"/>
+            <o:lock v:ext="edit" rotation="t" text="t"/>
+            <o:ink i="AIcBHQIEBAEQWM9UiuaXxU+PBvi60uGbIgMGSBBFI0YjBQU4PT4LZBk3MgqBx///D4DH//8PMwqB&#10;x///D4DH//8POAkA/v8DAAAAAAA9CADQBQMAAHpEPggAtAEDAAB6RAonBYexWOaxSICDiemAh9re&#10;AHbhUO0Z5yeCAIIACgARIKBLuDxZtdwB&#10;" annotation="t"/>
+          </v:rect>
+        </w:pict>
       </w:r>
       <w:r>
         <w:rPr>
@@ -461,6 +328,267 @@
         </w:rPr>
         <w:t>.</w:t>
       </w:r>
+    </w:p>
+    <w:p>
+      <w:pPr>
+        <w:rPr>
+          <w:lang w:val="en-US"/>
+        </w:rPr>
+      </w:pPr>
+    </w:p>
+    <w:p>
+      <w:pPr>
+        <w:rPr>
+          <w:lang w:val="en-US"/>
+        </w:rPr>
+      </w:pPr>
+      <w:r>
+        <w:rPr>
+          <w:lang w:val="en-US"/>
+        </w:rPr>
+        <w:br w:type="page"/>
+      </w:r>
+    </w:p>
+    <w:p>
+      <w:pPr>
+        <w:rPr>
+          <w:lang w:val="en-US"/>
+        </w:rPr>
+      </w:pPr>
+      <w:r>
+        <w:rPr>
+          <w:lang w:val="en-US"/>
+        </w:rPr>
+        <w:lastRenderedPageBreak/>
+        <w:t>1</w:t>
+      </w:r>
+      <w:r>
+        <w:rPr>
+          <w:vertAlign w:val="superscript"/>
+          <w:lang w:val="en-US"/>
+        </w:rPr>
+        <w:t>st</w:t>
+      </w:r>
+      <w:r>
+        <w:rPr>
+          <w:lang w:val="en-US"/>
+        </w:rPr>
+        <w:t xml:space="preserve"> Dungeon: </w:t>
+      </w:r>
+      <w:proofErr w:type="spellStart"/>
+      <w:r>
+        <w:rPr>
+          <w:lang w:val="en-US"/>
+        </w:rPr>
+        <w:t>Miniboss</w:t>
+      </w:r>
+      <w:proofErr w:type="spellEnd"/>
+      <w:r>
+        <w:rPr>
+          <w:lang w:val="en-US"/>
+        </w:rPr>
+        <w:t xml:space="preserve"> is a crazed elf member (maybe leader of the “Death Cult” (name pending)), </w:t>
+      </w:r>
+      <w:r>
+        <w:rPr>
+          <w:lang w:val="en-US"/>
+        </w:rPr>
+        <w:br/>
+        <w:t xml:space="preserve">Fight: Goblin waves coming from holes in the wall, </w:t>
+      </w:r>
+    </w:p>
+    <w:p>
+      <w:pPr>
+        <w:rPr>
+          <w:lang w:val="en-US"/>
+        </w:rPr>
+      </w:pPr>
+      <w:r>
+        <w:rPr>
+          <w:lang w:val="en-US"/>
+        </w:rPr>
+        <w:t>1</w:t>
+      </w:r>
+      <w:r>
+        <w:rPr>
+          <w:vertAlign w:val="superscript"/>
+          <w:lang w:val="en-US"/>
+        </w:rPr>
+        <w:t>st</w:t>
+      </w:r>
+      <w:r>
+        <w:rPr>
+          <w:lang w:val="en-US"/>
+        </w:rPr>
+        <w:t xml:space="preserve"> phase</w:t>
+      </w:r>
+      <w:r>
+        <w:rPr>
+          <w:lang w:val="en-US"/>
+        </w:rPr>
+        <w:t>:</w:t>
+      </w:r>
+      <w:r>
+        <w:rPr>
+          <w:lang w:val="en-US"/>
+        </w:rPr>
+        <w:t xml:space="preserve"> he has goblins that give him a shield and don’t respawn</w:t>
+      </w:r>
+      <w:r>
+        <w:rPr>
+          <w:lang w:val="en-US"/>
+        </w:rPr>
+        <w:t>, he throws daggers while he has shield</w:t>
+      </w:r>
+      <w:r>
+        <w:rPr>
+          <w:lang w:val="en-US"/>
+        </w:rPr>
+        <w:t xml:space="preserve">, </w:t>
+      </w:r>
+    </w:p>
+    <w:p>
+      <w:pPr>
+        <w:rPr>
+          <w:lang w:val="en-US"/>
+        </w:rPr>
+      </w:pPr>
+    </w:p>
+    <w:p>
+      <w:pPr>
+        <w:rPr>
+          <w:lang w:val="en-US"/>
+        </w:rPr>
+      </w:pPr>
+      <w:r>
+        <w:rPr>
+          <w:lang w:val="en-US"/>
+        </w:rPr>
+        <w:t>2</w:t>
+      </w:r>
+      <w:r>
+        <w:rPr>
+          <w:vertAlign w:val="superscript"/>
+          <w:lang w:val="en-US"/>
+        </w:rPr>
+        <w:t>nd</w:t>
+      </w:r>
+      <w:r>
+        <w:rPr>
+          <w:lang w:val="en-US"/>
+        </w:rPr>
+        <w:t xml:space="preserve"> phase: </w:t>
+      </w:r>
+      <w:r>
+        <w:rPr>
+          <w:lang w:val="en-US"/>
+        </w:rPr>
+        <w:t xml:space="preserve">when all </w:t>
+      </w:r>
+      <w:r>
+        <w:rPr>
+          <w:lang w:val="en-US"/>
+        </w:rPr>
+        <w:t xml:space="preserve">gobbos </w:t>
+      </w:r>
+      <w:r>
+        <w:rPr>
+          <w:lang w:val="en-US"/>
+        </w:rPr>
+        <w:t>are gone</w:t>
+      </w:r>
+      <w:r>
+        <w:rPr>
+          <w:lang w:val="en-US"/>
+        </w:rPr>
+        <w:t>, shield is gone</w:t>
+      </w:r>
+      <w:r>
+        <w:rPr>
+          <w:lang w:val="en-US"/>
+        </w:rPr>
+        <w:t xml:space="preserve">, </w:t>
+      </w:r>
+      <w:r>
+        <w:rPr>
+          <w:lang w:val="en-US"/>
+        </w:rPr>
+        <w:t xml:space="preserve">then </w:t>
+      </w:r>
+      <w:r>
+        <w:rPr>
+          <w:lang w:val="en-US"/>
+        </w:rPr>
+        <w:t xml:space="preserve">new goblins </w:t>
+      </w:r>
+      <w:r>
+        <w:rPr>
+          <w:lang w:val="en-US"/>
+        </w:rPr>
+        <w:t xml:space="preserve">start </w:t>
+      </w:r>
+      <w:r>
+        <w:rPr>
+          <w:lang w:val="en-US"/>
+        </w:rPr>
+        <w:t>com</w:t>
+      </w:r>
+      <w:r>
+        <w:rPr>
+          <w:lang w:val="en-US"/>
+        </w:rPr>
+        <w:t>ing</w:t>
+      </w:r>
+      <w:r>
+        <w:rPr>
+          <w:lang w:val="en-US"/>
+        </w:rPr>
+        <w:t xml:space="preserve">, </w:t>
+      </w:r>
+      <w:r>
+        <w:rPr>
+          <w:lang w:val="en-US"/>
+        </w:rPr>
+        <w:t>while recharging h</w:t>
+      </w:r>
+      <w:r>
+        <w:rPr>
+          <w:lang w:val="en-US"/>
+        </w:rPr>
+        <w:t xml:space="preserve">e </w:t>
+      </w:r>
+      <w:r>
+        <w:rPr>
+          <w:lang w:val="en-US"/>
+        </w:rPr>
+        <w:t xml:space="preserve">occasionally </w:t>
+      </w:r>
+      <w:r>
+        <w:rPr>
+          <w:lang w:val="en-US"/>
+        </w:rPr>
+        <w:t>kills Goblins to cast attacks until enough accumulated for his shield again</w:t>
+      </w:r>
+    </w:p>
+    <w:p>
+      <w:pPr>
+        <w:rPr>
+          <w:lang w:val="en-US"/>
+        </w:rPr>
+      </w:pPr>
+      <w:r>
+        <w:rPr>
+          <w:lang w:val="en-US"/>
+        </w:rPr>
+        <w:t xml:space="preserve">the sacrifice attacks are purple/red death magic daggers. They just look different but are otherwise the same. </w:t>
+      </w:r>
+    </w:p>
+    <w:p>
+      <w:pPr>
+        <w:rPr>
+          <w:lang w:val="en-US"/>
+        </w:rPr>
+      </w:pPr>
     </w:p>
     <w:sectPr>
       <w:pgSz w:w="12240" w:h="15840"/>
@@ -1402,99 +1530,6 @@
 </w:styles>
 </file>
 
-<file path=word/ink/ink1.xml><?xml version="1.0" encoding="utf-8"?>
-<inkml:ink xmlns:inkml="http://www.w3.org/2003/InkML">
-  <inkml:definitions>
-    <inkml:context xml:id="ctx0">
-      <inkml:inkSource xml:id="inkSrc0">
-        <inkml:traceFormat>
-          <inkml:channel name="X" type="integer" min="-2.14748E9" max="2.14748E9" units="cm"/>
-          <inkml:channel name="Y" type="integer" min="-2.14748E9" max="2.14748E9" units="cm"/>
-          <inkml:channel name="F" type="integer" max="32767" units="dev"/>
-          <inkml:channel name="OA" type="integer" max="360" units="deg"/>
-          <inkml:channel name="OE" type="integer" max="90" units="deg"/>
-        </inkml:traceFormat>
-        <inkml:channelProperties>
-          <inkml:channelProperty channel="X" name="resolution" value="1000" units="1/cm"/>
-          <inkml:channelProperty channel="Y" name="resolution" value="1000" units="1/cm"/>
-          <inkml:channelProperty channel="F" name="resolution" value="0" units="1/dev"/>
-          <inkml:channelProperty channel="OA" name="resolution" value="1000" units="1/deg"/>
-          <inkml:channelProperty channel="OE" name="resolution" value="1000" units="1/deg"/>
-        </inkml:channelProperties>
-      </inkml:inkSource>
-      <inkml:timestamp xml:id="ts0" timeString="2026-03-16T15:26:20.279"/>
-    </inkml:context>
-    <inkml:brush xml:id="br0">
-      <inkml:brushProperty name="width" value="0.035" units="cm"/>
-      <inkml:brushProperty name="height" value="0.035" units="cm"/>
-    </inkml:brush>
-  </inkml:definitions>
-  <inkml:trace contextRef="#ctx0" brushRef="#br0">16 1 244 0 0,'0'0'7985'0'0,"-16"22"-8213"0"0,45-19-2961 0 0</inkml:trace>
-</inkml:ink>
-</file>
-
-<file path=word/ink/ink2.xml><?xml version="1.0" encoding="utf-8"?>
-<inkml:ink xmlns:inkml="http://www.w3.org/2003/InkML">
-  <inkml:definitions>
-    <inkml:context xml:id="ctx0">
-      <inkml:inkSource xml:id="inkSrc0">
-        <inkml:traceFormat>
-          <inkml:channel name="X" type="integer" min="-2.14748E9" max="2.14748E9" units="cm"/>
-          <inkml:channel name="Y" type="integer" min="-2.14748E9" max="2.14748E9" units="cm"/>
-          <inkml:channel name="F" type="integer" max="32767" units="dev"/>
-          <inkml:channel name="OA" type="integer" max="360" units="deg"/>
-          <inkml:channel name="OE" type="integer" max="90" units="deg"/>
-        </inkml:traceFormat>
-        <inkml:channelProperties>
-          <inkml:channelProperty channel="X" name="resolution" value="1000" units="1/cm"/>
-          <inkml:channelProperty channel="Y" name="resolution" value="1000" units="1/cm"/>
-          <inkml:channelProperty channel="F" name="resolution" value="0" units="1/dev"/>
-          <inkml:channelProperty channel="OA" name="resolution" value="1000" units="1/deg"/>
-          <inkml:channelProperty channel="OE" name="resolution" value="1000" units="1/deg"/>
-        </inkml:channelProperties>
-      </inkml:inkSource>
-      <inkml:timestamp xml:id="ts0" timeString="2026-03-16T15:26:19.749"/>
-    </inkml:context>
-    <inkml:brush xml:id="br0">
-      <inkml:brushProperty name="width" value="0.035" units="cm"/>
-      <inkml:brushProperty name="height" value="0.035" units="cm"/>
-    </inkml:brush>
-  </inkml:definitions>
-  <inkml:trace contextRef="#ctx0" brushRef="#br0">32 0 112 0 0,'0'0'1544'0'0,"-20"15"172"0"0,9-5-960 0 0</inkml:trace>
-</inkml:ink>
-</file>
-
-<file path=word/ink/ink3.xml><?xml version="1.0" encoding="utf-8"?>
-<inkml:ink xmlns:inkml="http://www.w3.org/2003/InkML">
-  <inkml:definitions>
-    <inkml:context xml:id="ctx0">
-      <inkml:inkSource xml:id="inkSrc0">
-        <inkml:traceFormat>
-          <inkml:channel name="X" type="integer" min="-2.14748E9" max="2.14748E9" units="cm"/>
-          <inkml:channel name="Y" type="integer" min="-2.14748E9" max="2.14748E9" units="cm"/>
-          <inkml:channel name="F" type="integer" max="32767" units="dev"/>
-          <inkml:channel name="OA" type="integer" max="360" units="deg"/>
-          <inkml:channel name="OE" type="integer" max="90" units="deg"/>
-        </inkml:traceFormat>
-        <inkml:channelProperties>
-          <inkml:channelProperty channel="X" name="resolution" value="1000" units="1/cm"/>
-          <inkml:channelProperty channel="Y" name="resolution" value="1000" units="1/cm"/>
-          <inkml:channelProperty channel="F" name="resolution" value="0" units="1/dev"/>
-          <inkml:channelProperty channel="OA" name="resolution" value="1000" units="1/deg"/>
-          <inkml:channelProperty channel="OE" name="resolution" value="1000" units="1/deg"/>
-        </inkml:channelProperties>
-      </inkml:inkSource>
-      <inkml:timestamp xml:id="ts0" timeString="2026-03-16T15:26:18.970"/>
-    </inkml:context>
-    <inkml:brush xml:id="br0">
-      <inkml:brushProperty name="width" value="0.035" units="cm"/>
-      <inkml:brushProperty name="height" value="0.035" units="cm"/>
-    </inkml:brush>
-  </inkml:definitions>
-  <inkml:trace contextRef="#ctx0" brushRef="#br0">50 1 172 0 0,'0'0'2472'0'0,"-27"7"361"0"0,11 3-1869 0 0,9 0-1108 0 0</inkml:trace>
-</inkml:ink>
-</file>
-
 <file path=word/theme/theme1.xml><?xml version="1.0" encoding="utf-8"?>
 <a:theme xmlns:a="http://schemas.openxmlformats.org/drawingml/2006/main" name="Office Theme">
   <a:themeElements>

</xml_diff>